<commit_message>
Rewrite resume as world-class AI Engineer CV
Recast every bullet into business-problem -> architecture -> production
impact -> metric, with production-ownership voice, evaluation/observability/
agentic-systems and banking signals. Removed model-name and algorithm
dumping; repositioned from Data Scientist to AI Engineer.

https://claude.ai/code/session_01Mke6CVwT4vvgeJSyVZv8pc
</commit_message>
<xml_diff>
--- a/out/Dinc_Cetintas_AI_Engineer.docx
+++ b/out/Dinc_Cetintas_AI_Engineer.docx
@@ -55,7 +55,7 @@
     </w:p>
     <w:p>
       <w:r>
-        <w:t>AI Engineer specializing in Large Language Models, Generative AI, and production ML systems. I design, fine-tune, and deploy transformer-based models (GPT, T5, BERT) and RAG pipelines for business-critical use cases — document intelligence, conversational assistants, and workflow automation. Proven track record of shipping AI to production with MLOps (Docker, Kubernetes, MLflow) and optimizing models for real-time, low-latency inference. Strong bias for action and a record of AI solutions that drive measurable business impact.</w:t>
+        <w:t>AI Engineer who designs, builds, deploys, evaluates, and scales production AI systems in regulated financial environments. I own LLM and RAG platforms end-to-end — architecture, evaluation, agentic orchestration, model serving, and observability — delivering reliable, auditable, low-latency products used by real business teams. I combine software engineering, MLOps, and GenAI to turn mission-critical banking workflows into measurable gains in cost, speed, and risk reduction.</w:t>
       </w:r>
     </w:p>
     <w:p>
@@ -80,7 +80,7 @@
           <w:b/>
           <w:sz w:val="21"/>
         </w:rPr>
-        <w:t>AI Engineer / Data Scientist — Commercial Bank of Qatar, Doha</w:t>
+        <w:t>AI Engineer — Commercial Bank of Qatar, Doha</w:t>
       </w:r>
       <w:r>
         <w:tab/>
@@ -99,7 +99,7 @@
         <w:spacing w:after="60"/>
       </w:pPr>
       <w:r>
-        <w:t>Shipped production LLM systems (GPT, T5, BERT) for personalization, document summarization, and workflow automation, cutting manual processing across multiple business units by ~60%, by fine-tuning transformer models with Hugging Face Transformers and orchestrating them through LangChain.</w:t>
+        <w:t>Architected and owned production LLM platforms for document intelligence, workflow automation, and conversational AI, deployed for multiple business teams across a regulated bank.</w:t>
       </w:r>
     </w:p>
     <w:p>
@@ -108,7 +108,7 @@
         <w:spacing w:after="60"/>
       </w:pPr>
       <w:r>
-        <w:t>Delivered real-time answers from 900+ unstructured compliance documents at 87% source-linked retrieval accuracy by building a RAG assistant with an embedding + vector-retrieval pipeline (semantic chunking, re-ranking, citation grounding).</w:t>
+        <w:t>Designed a production RAG platform over 900+ compliance documents — hybrid retrieval, semantic chunking, reranking, and citation grounding — delivering auditable, source-linked answers at 87% retrieval accuracy.</w:t>
       </w:r>
     </w:p>
     <w:p>
@@ -117,7 +117,7 @@
         <w:spacing w:after="60"/>
       </w:pPr>
       <w:r>
-        <w:t>Reduced manual workload 70% and earned the COO Problem Solver Award by building a generative-AI email assistant that auto-classifies and responds to 500+ customer queries weekly (intent classification + LLM-generated drafts).</w:t>
+        <w:t>Built automated evaluation pipelines measuring retrieval quality, grounding, and hallucination rate, with human review loops, gating every release on quality thresholds before production.</w:t>
       </w:r>
     </w:p>
     <w:p>
@@ -126,7 +126,7 @@
         <w:spacing w:after="60"/>
       </w:pPr>
       <w:r>
-        <w:t>Extracted structured data from complex Arabic/English ID and financial documents — cutting document-handling time ~65% — by building 7 OCR + translation pipelines on Azure OCR and transformer models.</w:t>
+        <w:t>Productionized agentic workflows orchestrating LLM reasoning, tool calling, OCR, and structured outputs to automate 500+ customer inquiries weekly — reducing manual workload 70% and earning the COO Problem Solver Award.</w:t>
       </w:r>
     </w:p>
     <w:p>
@@ -135,7 +135,7 @@
         <w:spacing w:after="60"/>
       </w:pPr>
       <w:r>
-        <w:t>Flagged anomalous transactions and reduced fraud exposure by developing a supervised fraud-detection model (XGBoost, Logistic Regression) with advanced feature engineering, validated via A/B testing and ROC-AUC 0.93, handling severe class imbalance with resampling.</w:t>
+        <w:t>Engineered 7 OCR + document-extraction pipelines for complex Arabic/English identity and financial documents, accelerating document handling ~65% while preserving traceability and data privacy.</w:t>
       </w:r>
     </w:p>
     <w:p>
@@ -144,7 +144,7 @@
         <w:spacing w:after="60"/>
       </w:pPr>
       <w:r>
-        <w:t>Eliminated third-party translation spend (~$120K/yr) by launching an on-prem Arabic↔English document translator that preserves original layout, deployed fully in-house for data privacy.</w:t>
+        <w:t>Deployed a real-time fraud-detection system with engineered risk features and rigorous evaluation (A/B testing, ROC-AUC 0.93), flagging anomalous transactions and hardening the bank's risk controls.</w:t>
       </w:r>
     </w:p>
     <w:p>
@@ -153,7 +153,16 @@
         <w:spacing w:after="60"/>
       </w:pPr>
       <w:r>
-        <w:t>Cut production inference latency ~40% and enabled reproducible CI/CD model releases by containerizing and automating LLM deployment with Docker, MLflow, and Kubernetes.</w:t>
+        <w:t>Eliminated ~$120K/yr in third-party translation spend by building an on-prem Arabic↔English document translator that preserves layout and keeps sensitive data fully in-house.</w:t>
+      </w:r>
+    </w:p>
+    <w:p>
+      <w:pPr>
+        <w:pStyle w:val="ListBullet"/>
+        <w:spacing w:after="60"/>
+      </w:pPr>
+      <w:r>
+        <w:t>Owned end-to-end MLOps and observability — containerized model serving (Docker, Kubernetes, MLflow), CI/CD, monitoring, guardrails, caching, and model routing — cutting inference latency ~40% and ensuring production reliability.</w:t>
       </w:r>
     </w:p>
     <w:p>
@@ -184,7 +193,7 @@
         <w:spacing w:after="60"/>
       </w:pPr>
       <w:r>
-        <w:t>Delivered microsecond-level trade execution for 23 brokerage firms managing $10M+ portfolios by building a high-frequency trading platform and optimizing ITCH, OUCH, and TCP protocols for ultra-low latency.</w:t>
+        <w:t>Architected and delivered a high-frequency trading platform for 23 brokerage firms managing $10M+ in portfolios, achieving microsecond-level execution by optimizing ITCH, OUCH, and TCP protocols for ultra-low latency.</w:t>
       </w:r>
     </w:p>
     <w:p>
@@ -193,7 +202,7 @@
         <w:spacing w:after="60"/>
       </w:pPr>
       <w:r>
-        <w:t>Built the full platform — frontend UI, backend services, and live market-data feeds from co-located exchange servers — using React, C#, and C++.</w:t>
+        <w:t>Built and owned the full production stack — React/C#/C++ frontend, backend services, and co-located live market-data feeds — under strict real-time reliability constraints.</w:t>
       </w:r>
     </w:p>
     <w:p>
@@ -202,7 +211,7 @@
         <w:spacing w:after="60"/>
       </w:pPr>
       <w:r>
-        <w:t>Owned end-to-end system reliability and latency across the full stack, sustaining 99.9% uptime under live trading load.</w:t>
+        <w:t>Owned end-to-end system performance and reliability, sustaining 99.9% uptime under live trading load.</w:t>
       </w:r>
     </w:p>
     <w:p>
@@ -214,7 +223,7 @@
           <w:b/>
           <w:sz w:val="21"/>
         </w:rPr>
-        <w:t>Data Scientist — Schneider Electric, İstanbul</w:t>
+        <w:t>Machine Learning Engineer — Schneider Electric, İstanbul</w:t>
       </w:r>
       <w:r>
         <w:tab/>
@@ -233,7 +242,7 @@
         <w:spacing w:after="60"/>
       </w:pPr>
       <w:r>
-        <w:t>Reduced inventory gaps 12–15% during COVID-related supply shocks by developing and validating demand-forecasting and stock-out-risk models (Random Forest, XGBoost).</w:t>
+        <w:t>Built and deployed demand-forecasting and stock-out-risk models that reduced inventory gaps 12–15% during COVID supply shocks, directly improving fulfillment reliability.</w:t>
       </w:r>
     </w:p>
     <w:p>
@@ -242,7 +251,7 @@
         <w:spacing w:after="60"/>
       </w:pPr>
       <w:r>
-        <w:t>Improved forecast accuracy by engineering features from sales, supply-chain, and distributor data and applying time-series analysis and model tuning.</w:t>
+        <w:t>Engineered features from sales, supply-chain, and distributor data and built reproducible model pipelines with rigorous evaluation (cross-validation, holdout testing) for scalable deployment.</w:t>
       </w:r>
     </w:p>
     <w:p>
@@ -251,16 +260,7 @@
         <w:spacing w:after="60"/>
       </w:pPr>
       <w:r>
-        <w:t>Enabled scalable, reproducible deployment by designing evaluation frameworks (cross-validation, holdout testing) and building model pipelines.</w:t>
-      </w:r>
-    </w:p>
-    <w:p>
-      <w:pPr>
-        <w:pStyle w:val="ListBullet"/>
-        <w:spacing w:after="60"/>
-      </w:pPr>
-      <w:r>
-        <w:t>Aligned model outputs with logistics and fulfillment planning by partnering with stakeholders on success metrics; delivered analysis via SQL, Python (pandas, scikit-learn), and Power BI.</w:t>
+        <w:t>Partnered with logistics stakeholders to define success metrics and operationalize forecasts into fulfillment planning.</w:t>
       </w:r>
     </w:p>
     <w:p>
@@ -331,10 +331,10 @@
         <w:rPr>
           <w:b/>
         </w:rPr>
-        <w:t xml:space="preserve">Generative AI / LLMs: </w:t>
+        <w:t xml:space="preserve">AI Systems / GenAI: </w:t>
       </w:r>
       <w:r>
-        <w:t>RAG, fine-tuning, prompt engineering, transformers (GPT, BERT, T5), Hugging Face, LangChain, OpenAI APIs, embeddings &amp; vector retrieval</w:t>
+        <w:t>LLM systems, RAG (hybrid retrieval, reranking, citation grounding), agentic &amp; multi-step workflows, tool / function calling, prompt &amp; context engineering, AI orchestration, structured outputs</w:t>
       </w:r>
     </w:p>
     <w:p>
@@ -345,10 +345,10 @@
         <w:rPr>
           <w:b/>
         </w:rPr>
-        <w:t xml:space="preserve">ML / Data Science: </w:t>
+        <w:t xml:space="preserve">AI Engineering / LLMOps: </w:t>
       </w:r>
       <w:r>
-        <w:t>Supervised &amp; unsupervised learning, XGBoost, Random Forest, feature engineering, time-series forecasting, statistical analysis &amp; hypothesis testing, A/B testing, model evaluation</w:t>
+        <w:t>Automated evaluation (retrieval quality, grounding, hallucination mitigation), human review loops, benchmarking, observability &amp; logging, guardrails, caching, model routing, latency optimization, reliability engineering</w:t>
       </w:r>
     </w:p>
     <w:p>
@@ -359,10 +359,10 @@
         <w:rPr>
           <w:b/>
         </w:rPr>
-        <w:t xml:space="preserve">MLOps &amp; Deployment: </w:t>
+        <w:t xml:space="preserve">Production / Platform: </w:t>
       </w:r>
       <w:r>
-        <w:t>Docker, Kubernetes, MLflow, CI/CD, real-time inference optimization, model serving</w:t>
+        <w:t>APIs, model serving, Docker, Kubernetes, MLflow, CI/CD, monitoring</w:t>
       </w:r>
     </w:p>
     <w:p>
@@ -373,10 +373,24 @@
         <w:rPr>
           <w:b/>
         </w:rPr>
-        <w:t xml:space="preserve">Cloud: </w:t>
+        <w:t xml:space="preserve">ML Foundations: </w:t>
       </w:r>
       <w:r>
-        <w:t>Azure (OCR, Translation, Custom Models), AWS</w:t>
+        <w:t>Supervised &amp; unsupervised learning, feature engineering, time-series forecasting, A/B testing, statistical evaluation</w:t>
+      </w:r>
+    </w:p>
+    <w:p>
+      <w:pPr>
+        <w:spacing w:after="40"/>
+      </w:pPr>
+      <w:r>
+        <w:rPr>
+          <w:b/>
+        </w:rPr>
+        <w:t xml:space="preserve">Cloud &amp; Data: </w:t>
+      </w:r>
+      <w:r>
+        <w:t>Azure (OCR, Translation, Custom Models), AWS, SQL</w:t>
       </w:r>
     </w:p>
     <w:p>
@@ -390,7 +404,7 @@
         <w:t xml:space="preserve">Programming: </w:t>
       </w:r>
       <w:r>
-        <w:t>Python (pandas, scikit-learn), SQL; Full-stack (React, C#, C++)</w:t>
+        <w:t>Python; full-stack (React, C#, C++)</w:t>
       </w:r>
     </w:p>
     <w:p>
@@ -408,7 +422,7 @@
     </w:p>
     <w:p>
       <w:r>
-        <w:t>Machine Learning Specialization (Stanford) · Visa Data Science Bootcamp · TensorFlow in AI/ML/DL (DeepLearning.AI) · Operationalizing LLMs on Azure (Duke) · Generative AI Applications with RAG &amp; LangChain (IBM) · AI Agents (IBM) · Generative AI Techniques &amp; Applications (Duke) · Deep Learning for Sequences &amp; Time Series (DeepLearning.AI) · Supervised/Unsupervised Learning with scikit-learn (DataCamp)</w:t>
+        <w:t>Operationalizing LLMs on Azure (Duke) · Generative AI Applications with RAG &amp; LangChain (IBM) · AI Agents (IBM) · Generative AI Techniques &amp; Applications (Duke) · Machine Learning Specialization (Stanford) · TensorFlow in AI/ML/DL (DeepLearning.AI) · Deep Learning for Sequences &amp; Time Series (DeepLearning.AI) · Visa Data Science Bootcamp</w:t>
       </w:r>
     </w:p>
     <w:p>

</xml_diff>

<commit_message>
Refine AI Engineer CV: real scale, narrowed claims, Selected AI Systems
Adds confirmed scale (7+ teams, 200+ users); narrows MLOps bullet to
serving + monitoring/observability and removes unclaimed guardrails/
caching/routing/CI-CD; reframes fraud bullet as a production pipeline;
adds FastAPI/REST + service-architecture emphasis; adds a Selected AI
Systems section.

https://claude.ai/code/session_01Mke6CVwT4vvgeJSyVZv8pc
</commit_message>
<xml_diff>
--- a/out/Dinc_Cetintas_AI_Engineer.docx
+++ b/out/Dinc_Cetintas_AI_Engineer.docx
@@ -55,7 +55,7 @@
     </w:p>
     <w:p>
       <w:r>
-        <w:t>AI Engineer who designs, builds, deploys, evaluates, and scales production AI systems in regulated financial environments. I own LLM and RAG platforms end-to-end — architecture, evaluation, agentic orchestration, model serving, and observability — delivering reliable, auditable, low-latency products used by real business teams. I combine software engineering, MLOps, and GenAI to turn mission-critical banking workflows into measurable gains in cost, speed, and risk reduction.</w:t>
+        <w:t>AI Engineer who designs, builds, deploys, evaluates, and scales production AI systems in regulated financial environments. I own LLM and RAG platforms end-to-end — architecture, evaluation, agentic orchestration, APIs, model serving, and observability — delivering reliable, auditable, low-latency products used across 7+ business teams and 200+ internal users. I combine software engineering, MLOps, and GenAI to turn mission-critical banking workflows into measurable gains in cost, speed, and risk reduction.</w:t>
       </w:r>
     </w:p>
     <w:p>
@@ -99,7 +99,7 @@
         <w:spacing w:after="60"/>
       </w:pPr>
       <w:r>
-        <w:t>Architected and owned production LLM platforms for document intelligence, workflow automation, and conversational AI, deployed for multiple business teams across a regulated bank.</w:t>
+        <w:t>Architected and owned production LLM and RAG platforms for document intelligence, workflow automation, and conversational AI, deployed across 7+ business teams and 200+ internal users at a regulated bank.</w:t>
       </w:r>
     </w:p>
     <w:p>
@@ -108,7 +108,7 @@
         <w:spacing w:after="60"/>
       </w:pPr>
       <w:r>
-        <w:t>Designed a production RAG platform over 900+ compliance documents — hybrid retrieval, semantic chunking, reranking, and citation grounding — delivering auditable, source-linked answers at 87% retrieval accuracy.</w:t>
+        <w:t>Designed the RAG architecture — hybrid retrieval, semantic chunking, reranking, and citation grounding over 900+ compliance documents — delivering auditable, source-linked answers at 87% retrieval accuracy.</w:t>
       </w:r>
     </w:p>
     <w:p>
@@ -126,7 +126,7 @@
         <w:spacing w:after="60"/>
       </w:pPr>
       <w:r>
-        <w:t>Productionized agentic workflows orchestrating LLM reasoning, tool calling, OCR, and structured outputs to automate 500+ customer inquiries weekly — reducing manual workload 70% and earning the COO Problem Solver Award.</w:t>
+        <w:t>Productionized agentic workflows (LLM reasoning, tool calling, OCR, structured outputs) powering inquiry automation — 500+ requests/week, 70% manual-load reduction, COO Problem Solver Award — and credit-risk &amp; financial-analysis report generation.</w:t>
       </w:r>
     </w:p>
     <w:p>
@@ -135,7 +135,7 @@
         <w:spacing w:after="60"/>
       </w:pPr>
       <w:r>
-        <w:t>Engineered 7 OCR + document-extraction pipelines for complex Arabic/English identity and financial documents, accelerating document handling ~65% while preserving traceability and data privacy.</w:t>
+        <w:t>Built and owned the FastAPI / REST services and model-serving layer (Docker, Kubernetes, MLflow) with production monitoring and observability, cutting inference latency ~40% and ensuring reliability.</w:t>
       </w:r>
     </w:p>
     <w:p>
@@ -144,7 +144,7 @@
         <w:spacing w:after="60"/>
       </w:pPr>
       <w:r>
-        <w:t>Deployed a real-time fraud-detection system with engineered risk features and rigorous evaluation (A/B testing, ROC-AUC 0.93), flagging anomalous transactions and hardening the bank's risk controls.</w:t>
+        <w:t>Designed and deployed a production fraud-detection pipeline combining engineered risk features, model evaluation, and monitoring, achieving ROC-AUC 0.93 while strengthening real-time transaction risk controls.</w:t>
       </w:r>
     </w:p>
     <w:p>
@@ -153,16 +153,7 @@
         <w:spacing w:after="60"/>
       </w:pPr>
       <w:r>
-        <w:t>Eliminated ~$120K/yr in third-party translation spend by building an on-prem Arabic↔English document translator that preserves layout and keeps sensitive data fully in-house.</w:t>
-      </w:r>
-    </w:p>
-    <w:p>
-      <w:pPr>
-        <w:pStyle w:val="ListBullet"/>
-        <w:spacing w:after="60"/>
-      </w:pPr>
-      <w:r>
-        <w:t>Owned end-to-end MLOps and observability — containerized model serving (Docker, Kubernetes, MLflow), CI/CD, monitoring, guardrails, caching, and model routing — cutting inference latency ~40% and ensuring production reliability.</w:t>
+        <w:t>Delivered an on-prem Arabic↔English document-translation platform that preserves layout and keeps sensitive data fully in-house, eliminating ~$120K/yr in third-party translation spend.</w:t>
       </w:r>
     </w:p>
     <w:p>
@@ -348,7 +339,7 @@
         <w:t xml:space="preserve">AI Engineering / LLMOps: </w:t>
       </w:r>
       <w:r>
-        <w:t>Automated evaluation (retrieval quality, grounding, hallucination mitigation), human review loops, benchmarking, observability &amp; logging, guardrails, caching, model routing, latency optimization, reliability engineering</w:t>
+        <w:t>Automated evaluation (retrieval quality, grounding, hallucination mitigation), human review loops, benchmarking, observability &amp; logging, latency optimization, reliability engineering</w:t>
       </w:r>
     </w:p>
     <w:p>
@@ -362,7 +353,7 @@
         <w:t xml:space="preserve">Production / Platform: </w:t>
       </w:r>
       <w:r>
-        <w:t>APIs, model serving, Docker, Kubernetes, MLflow, CI/CD, monitoring</w:t>
+        <w:t>FastAPI / REST APIs, backend &amp; service architecture, model serving, Docker, Kubernetes, MLflow, monitoring</w:t>
       </w:r>
     </w:p>
     <w:p>
@@ -405,6 +396,109 @@
       </w:r>
       <w:r>
         <w:t>Python; full-stack (React, C#, C++)</w:t>
+      </w:r>
+    </w:p>
+    <w:p>
+      <w:pPr>
+        <w:spacing w:before="200" w:after="40"/>
+      </w:pPr>
+      <w:r>
+        <w:rPr>
+          <w:b/>
+          <w:color w:val="1F3A5F"/>
+          <w:sz w:val="22"/>
+        </w:rPr>
+        <w:t>SELECTED AI SYSTEMS</w:t>
+      </w:r>
+    </w:p>
+    <w:p>
+      <w:pPr>
+        <w:pStyle w:val="ListBullet"/>
+        <w:spacing w:after="40"/>
+      </w:pPr>
+      <w:r>
+        <w:rPr>
+          <w:b/>
+        </w:rPr>
+        <w:t xml:space="preserve">Enterprise RAG Platform — </w:t>
+      </w:r>
+      <w:r>
+        <w:t>900+ compliance documents; auditable, source-linked answers at 87% accuracy</w:t>
+      </w:r>
+    </w:p>
+    <w:p>
+      <w:pPr>
+        <w:pStyle w:val="ListBullet"/>
+        <w:spacing w:after="40"/>
+      </w:pPr>
+      <w:r>
+        <w:rPr>
+          <w:b/>
+        </w:rPr>
+        <w:t xml:space="preserve">AI Email / Inquiry Assistant — </w:t>
+      </w:r>
+      <w:r>
+        <w:t>500+ requests/week automated; 70% manual-load reduction</w:t>
+      </w:r>
+    </w:p>
+    <w:p>
+      <w:pPr>
+        <w:pStyle w:val="ListBullet"/>
+        <w:spacing w:after="40"/>
+      </w:pPr>
+      <w:r>
+        <w:rPr>
+          <w:b/>
+        </w:rPr>
+        <w:t xml:space="preserve">Credit Risk Report Generation Platform — </w:t>
+      </w:r>
+      <w:r>
+        <w:t>agentic generation of analyst-ready credit-risk reports</w:t>
+      </w:r>
+    </w:p>
+    <w:p>
+      <w:pPr>
+        <w:pStyle w:val="ListBullet"/>
+        <w:spacing w:after="40"/>
+      </w:pPr>
+      <w:r>
+        <w:rPr>
+          <w:b/>
+        </w:rPr>
+        <w:t xml:space="preserve">Financial Analysis Agent Workflows — </w:t>
+      </w:r>
+      <w:r>
+        <w:t>multi-step LLM reasoning + tool calling over financial data</w:t>
+      </w:r>
+    </w:p>
+    <w:p>
+      <w:pPr>
+        <w:pStyle w:val="ListBullet"/>
+        <w:spacing w:after="40"/>
+      </w:pPr>
+      <w:r>
+        <w:rPr>
+          <w:b/>
+        </w:rPr>
+        <w:t xml:space="preserve">OCR &amp; Document Intelligence Platform — </w:t>
+      </w:r>
+      <w:r>
+        <w:t>7 extraction pipelines for Arabic/English ID &amp; financial docs</w:t>
+      </w:r>
+    </w:p>
+    <w:p>
+      <w:pPr>
+        <w:pStyle w:val="ListBullet"/>
+        <w:spacing w:after="40"/>
+      </w:pPr>
+      <w:r>
+        <w:rPr>
+          <w:b/>
+        </w:rPr>
+        <w:t xml:space="preserve">Arabic↔English Translation Platform — </w:t>
+      </w:r>
+      <w:r>
+        <w:t>on-prem, layout-preserving; ~$120K/yr third-party spend eliminated</w:t>
       </w:r>
     </w:p>
     <w:p>

</xml_diff>

<commit_message>
Polish CV to top-5%: governance bullet, regulated-AI signal, leaner profile
Tightens the profile (removes keyword-list feel, drops repeated 'agentic
orchestration'), reframes the eval bullet as evaluation & release
governance (AI quality ownership), reframes fraud as a real-time service,
adds explainability/traceability/compliance + a Regulated AI skills line,
and trims the skills section.

https://claude.ai/code/session_01Mke6CVwT4vvgeJSyVZv8pc
</commit_message>
<xml_diff>
--- a/out/Dinc_Cetintas_AI_Engineer.docx
+++ b/out/Dinc_Cetintas_AI_Engineer.docx
@@ -55,7 +55,7 @@
     </w:p>
     <w:p>
       <w:r>
-        <w:t>AI Engineer who designs, builds, deploys, evaluates, and scales production AI systems in regulated financial environments. I own LLM and RAG platforms end-to-end — architecture, evaluation, agentic orchestration, APIs, model serving, and observability — delivering reliable, auditable, low-latency products used across 7+ business teams and 200+ internal users. I combine software engineering, MLOps, and GenAI to turn mission-critical banking workflows into measurable gains in cost, speed, and risk reduction.</w:t>
+        <w:t>AI Engineer who owns production AI platforms end-to-end — from architecture and evaluation to deployment, observability, and continuous improvement — in regulated financial environments. I ship reliable, auditable, low-latency LLM and RAG systems used across 7+ business teams and 200+ internal users, combining software engineering, MLOps, and GenAI to turn mission-critical banking workflows into measurable gains in cost, speed, and risk reduction.</w:t>
       </w:r>
     </w:p>
     <w:p>
@@ -99,7 +99,7 @@
         <w:spacing w:after="60"/>
       </w:pPr>
       <w:r>
-        <w:t>Architected and owned production LLM and RAG platforms for document intelligence, workflow automation, and conversational AI, deployed across 7+ business teams and 200+ internal users at a regulated bank.</w:t>
+        <w:t>Architected and owned production LLM and RAG platforms for document intelligence, workflow automation, and conversational AI, deployed across 7+ business teams and 200+ internal users under banking compliance and data-governance controls.</w:t>
       </w:r>
     </w:p>
     <w:p>
@@ -108,7 +108,7 @@
         <w:spacing w:after="60"/>
       </w:pPr>
       <w:r>
-        <w:t>Designed the RAG architecture — hybrid retrieval, semantic chunking, reranking, and citation grounding over 900+ compliance documents — delivering auditable, source-linked answers at 87% retrieval accuracy.</w:t>
+        <w:t>Designed the RAG architecture — hybrid retrieval, semantic chunking, reranking, and citation grounding over 900+ compliance documents — delivering explainable, fully traceable, source-linked answers at 87% retrieval accuracy.</w:t>
       </w:r>
     </w:p>
     <w:p>
@@ -117,7 +117,7 @@
         <w:spacing w:after="60"/>
       </w:pPr>
       <w:r>
-        <w:t>Built automated evaluation pipelines measuring retrieval quality, grounding, and hallucination rate, with human review loops, gating every release on quality thresholds before production.</w:t>
+        <w:t>Established evaluation and release governance for production AI — automated quality benchmarks (retrieval quality, grounding, hallucination mitigation), human review loops, and auditability requirements enforced before every deployment.</w:t>
       </w:r>
     </w:p>
     <w:p>
@@ -144,7 +144,7 @@
         <w:spacing w:after="60"/>
       </w:pPr>
       <w:r>
-        <w:t>Designed and deployed a production fraud-detection pipeline combining engineered risk features, model evaluation, and monitoring, achieving ROC-AUC 0.93 while strengthening real-time transaction risk controls.</w:t>
+        <w:t>Designed and deployed a real-time fraud-detection service integrating engineered risk features, model evaluation, and monitoring, achieving ROC-AUC 0.93 while strengthening transaction-risk controls.</w:t>
       </w:r>
     </w:p>
     <w:p>
@@ -325,7 +325,7 @@
         <w:t xml:space="preserve">AI Systems / GenAI: </w:t>
       </w:r>
       <w:r>
-        <w:t>LLM systems, RAG (hybrid retrieval, reranking, citation grounding), agentic &amp; multi-step workflows, tool / function calling, prompt &amp; context engineering, AI orchestration, structured outputs</w:t>
+        <w:t>LLM systems, RAG (hybrid retrieval, reranking, citation grounding), agentic workflows, tool / function calling, prompt &amp; context engineering, structured outputs</w:t>
       </w:r>
     </w:p>
     <w:p>
@@ -339,7 +339,21 @@
         <w:t xml:space="preserve">AI Engineering / LLMOps: </w:t>
       </w:r>
       <w:r>
-        <w:t>Automated evaluation (retrieval quality, grounding, hallucination mitigation), human review loops, benchmarking, observability &amp; logging, latency optimization, reliability engineering</w:t>
+        <w:t>Automated evaluation (retrieval quality, grounding, hallucination mitigation), human review loops, observability &amp; logging, latency optimization, reliability engineering</w:t>
+      </w:r>
+    </w:p>
+    <w:p>
+      <w:pPr>
+        <w:spacing w:after="40"/>
+      </w:pPr>
+      <w:r>
+        <w:rPr>
+          <w:b/>
+        </w:rPr>
+        <w:t xml:space="preserve">Regulated AI: </w:t>
+      </w:r>
+      <w:r>
+        <w:t>Auditability, traceability, explainability, compliance &amp; release governance</w:t>
       </w:r>
     </w:p>
     <w:p>
@@ -367,7 +381,7 @@
         <w:t xml:space="preserve">ML Foundations: </w:t>
       </w:r>
       <w:r>
-        <w:t>Supervised &amp; unsupervised learning, feature engineering, time-series forecasting, A/B testing, statistical evaluation</w:t>
+        <w:t>Supervised &amp; unsupervised learning, feature engineering, time-series forecasting, A/B testing</w:t>
       </w:r>
     </w:p>
     <w:p>
@@ -378,24 +392,10 @@
         <w:rPr>
           <w:b/>
         </w:rPr>
-        <w:t xml:space="preserve">Cloud &amp; Data: </w:t>
+        <w:t xml:space="preserve">Cloud &amp; Languages: </w:t>
       </w:r>
       <w:r>
-        <w:t>Azure (OCR, Translation, Custom Models), AWS, SQL</w:t>
-      </w:r>
-    </w:p>
-    <w:p>
-      <w:pPr>
-        <w:spacing w:after="40"/>
-      </w:pPr>
-      <w:r>
-        <w:rPr>
-          <w:b/>
-        </w:rPr>
-        <w:t xml:space="preserve">Programming: </w:t>
-      </w:r>
-      <w:r>
-        <w:t>Python; full-stack (React, C#, C++)</w:t>
+        <w:t>Azure, AWS, SQL · Python; full-stack (React, C#, C++)</w:t>
       </w:r>
     </w:p>
     <w:p>

</xml_diff>

<commit_message>
Split crammed agentic bullet into 3 distinct project bullets
Separates the email/inquiry assistant, agentic credit-risk &
financial-analysis report generation, and the OCR/document-intelligence
pipeline so each project is clearly showcased.

https://claude.ai/code/session_01Mke6CVwT4vvgeJSyVZv8pc
</commit_message>
<xml_diff>
--- a/out/Dinc_Cetintas_AI_Engineer.docx
+++ b/out/Dinc_Cetintas_AI_Engineer.docx
@@ -126,7 +126,25 @@
         <w:spacing w:after="60"/>
       </w:pPr>
       <w:r>
-        <w:t>Productionized agentic workflows (LLM reasoning, tool calling, OCR, structured outputs) powering inquiry automation — 500+ requests/week, 70% manual-load reduction, COO Problem Solver Award — and credit-risk &amp; financial-analysis report generation.</w:t>
+        <w:t>Built an AI email &amp; inquiry assistant that auto-classifies and drafts responses to 500+ requests/week using LLM reasoning and structured outputs, cutting manual workload 70% and earning the COO Problem Solver Award.</w:t>
+      </w:r>
+    </w:p>
+    <w:p>
+      <w:pPr>
+        <w:pStyle w:val="ListBullet"/>
+        <w:spacing w:after="60"/>
+      </w:pPr>
+      <w:r>
+        <w:t>Developed agentic credit-risk and financial-analysis report-generation workflows that retrieve data via tool calling, reason over it, and produce structured, analyst-ready reports.</w:t>
+      </w:r>
+    </w:p>
+    <w:p>
+      <w:pPr>
+        <w:pStyle w:val="ListBullet"/>
+        <w:spacing w:after="60"/>
+      </w:pPr>
+      <w:r>
+        <w:t>Engineered an OCR &amp; document-intelligence pipeline (7 extraction flows) for complex Arabic/English identity and financial documents, accelerating document handling ~65% with full traceability.</w:t>
       </w:r>
     </w:p>
     <w:p>

</xml_diff>

<commit_message>
Reframe MeeApps role around the HFT algorithm developed and adopted by 23 firms
Leads with the trading algorithm Dinc designed (adopted by 23 brokerage
firms) rather than a 'platform built for them'; folds protocol/latency
optimization and the production stack into a supporting bullet.

https://claude.ai/code/session_01Mke6CVwT4vvgeJSyVZv8pc
</commit_message>
<xml_diff>
--- a/out/Dinc_Cetintas_AI_Engineer.docx
+++ b/out/Dinc_Cetintas_AI_Engineer.docx
@@ -202,7 +202,7 @@
         <w:spacing w:after="60"/>
       </w:pPr>
       <w:r>
-        <w:t>Architected and delivered a high-frequency trading platform for 23 brokerage firms managing $10M+ in portfolios, achieving microsecond-level execution by optimizing ITCH, OUCH, and TCP protocols for ultra-low latency.</w:t>
+        <w:t>Designed and developed a high-frequency trading algorithm adopted by 23 brokerage firms managing $10M+ in portfolios, achieving microsecond-level order execution.</w:t>
       </w:r>
     </w:p>
     <w:p>
@@ -211,7 +211,7 @@
         <w:spacing w:after="60"/>
       </w:pPr>
       <w:r>
-        <w:t>Built and owned the full production stack — React/C#/C++ frontend, backend services, and co-located live market-data feeds — under strict real-time reliability constraints.</w:t>
+        <w:t>Engineered the ultra-low-latency execution path — optimizing ITCH, OUCH, and TCP protocols against co-located exchange servers — and built the full production stack (React/C#/C++ frontend, backend services, and live market-data feeds).</w:t>
       </w:r>
     </w:p>
     <w:p>

</xml_diff>

<commit_message>
Premium redesign + clickable links; drop visa line
Removes 'no visa sponsorship required'; makes LinkedIn, GitHub
(github.com/dinccetintas), and email clickable in both DOCX and PDF.
Premium look: serif name, letter-spaced uppercase section headers with
rule lines, right-aligned role dates, header divider, refined spacing.

https://claude.ai/code/session_01Mke6CVwT4vvgeJSyVZv8pc
</commit_message>
<xml_diff>
--- a/out/Dinc_Cetintas_AI_Engineer.docx
+++ b/out/Dinc_Cetintas_AI_Engineer.docx
@@ -4,51 +4,126 @@
   <w:body>
     <w:p>
       <w:pPr>
-        <w:spacing w:after="0"/>
+        <w:spacing w:after="20"/>
         <w:jc w:val="center"/>
       </w:pPr>
       <w:r>
         <w:rPr>
+          <w:rFonts w:ascii="Georgia" w:hAnsi="Georgia"/>
           <w:b/>
-          <w:sz w:val="40"/>
+          <w:color w:val="1A1A1A"/>
+          <w:sz w:val="48"/>
+          <w:spacing w:val="20"/>
         </w:rPr>
         <w:t>DINC CETINTAS</w:t>
       </w:r>
     </w:p>
     <w:p>
       <w:pPr>
-        <w:spacing w:after="40"/>
+        <w:spacing w:after="60"/>
         <w:jc w:val="center"/>
       </w:pPr>
       <w:r>
         <w:rPr>
           <w:color w:val="1F3A5F"/>
-          <w:sz w:val="24"/>
+          <w:sz w:val="22"/>
+          <w:spacing w:val="48"/>
         </w:rPr>
-        <w:t>AI Engineer</w:t>
+        <w:t>AI ENGINEER</w:t>
       </w:r>
     </w:p>
     <w:p>
       <w:pPr>
-        <w:spacing w:after="80"/>
+        <w:spacing w:after="180"/>
         <w:jc w:val="center"/>
+        <w:pBdr>
+          <w:bottom w:val="single" w:sz="4" w:space="4" w:color="1F3A5F"/>
+        </w:pBdr>
       </w:pPr>
       <w:r>
         <w:rPr>
+          <w:color w:val="565656"/>
           <w:sz w:val="17"/>
         </w:rPr>
-        <w:t>EU Citizen — no visa sponsorship required  ·  Cyprus  ·  dinccetintas24@gmail.com  ·  +974 51444964  ·  linkedin.com/in/dinc-cetintas-79a04b205  ·  GitHub</w:t>
+        <w:t>EU Citizen, Cyprus</w:t>
       </w:r>
+      <w:r>
+        <w:rPr>
+          <w:color w:val="AAAAAA"/>
+          <w:sz w:val="17"/>
+        </w:rPr>
+        <w:t xml:space="preserve">   |   </w:t>
+      </w:r>
+      <w:hyperlink r:id="rId9">
+        <w:r>
+          <w:rPr>
+            <w:color w:val="1F3A5F"/>
+            <w:sz w:val="17"/>
+          </w:rPr>
+          <w:t xml:space="preserve">dinccetintas24@gmail.com</w:t>
+        </w:r>
+      </w:hyperlink>
+      <w:r>
+        <w:rPr>
+          <w:color w:val="AAAAAA"/>
+          <w:sz w:val="17"/>
+        </w:rPr>
+        <w:t xml:space="preserve">   |   </w:t>
+      </w:r>
+      <w:r>
+        <w:rPr>
+          <w:color w:val="565656"/>
+          <w:sz w:val="17"/>
+        </w:rPr>
+        <w:t>+974 51444964</w:t>
+      </w:r>
+      <w:r>
+        <w:rPr>
+          <w:color w:val="AAAAAA"/>
+          <w:sz w:val="17"/>
+        </w:rPr>
+        <w:t xml:space="preserve">   |   </w:t>
+      </w:r>
+      <w:hyperlink r:id="rId10">
+        <w:r>
+          <w:rPr>
+            <w:color w:val="1F3A5F"/>
+            <w:sz w:val="17"/>
+          </w:rPr>
+          <w:t xml:space="preserve">LinkedIn</w:t>
+        </w:r>
+      </w:hyperlink>
+      <w:r>
+        <w:rPr>
+          <w:color w:val="AAAAAA"/>
+          <w:sz w:val="17"/>
+        </w:rPr>
+        <w:t xml:space="preserve">   |   </w:t>
+      </w:r>
+      <w:hyperlink r:id="rId11">
+        <w:r>
+          <w:rPr>
+            <w:color w:val="1F3A5F"/>
+            <w:sz w:val="17"/>
+          </w:rPr>
+          <w:t xml:space="preserve">GitHub</w:t>
+        </w:r>
+      </w:hyperlink>
     </w:p>
     <w:p>
       <w:pPr>
-        <w:spacing w:before="200" w:after="40"/>
+        <w:spacing w:before="220" w:after="80"/>
+        <w:pBdr>
+          <w:bottom w:val="single" w:sz="6" w:space="3" w:color="1F3A5F"/>
+        </w:pBdr>
       </w:pPr>
       <w:r>
         <w:rPr>
+          <w:rFonts w:ascii="Calibri" w:hAnsi="Calibri"/>
           <w:b/>
           <w:color w:val="1F3A5F"/>
-          <w:sz w:val="22"/>
+          <w:sz w:val="21"/>
+          <w:spacing w:val="24"/>
         </w:rPr>
         <w:t>PROFILE</w:t>
       </w:r>
@@ -60,20 +135,28 @@
     </w:p>
     <w:p>
       <w:pPr>
-        <w:spacing w:before="200" w:after="40"/>
+        <w:spacing w:before="220" w:after="80"/>
+        <w:pBdr>
+          <w:bottom w:val="single" w:sz="6" w:space="3" w:color="1F3A5F"/>
+        </w:pBdr>
       </w:pPr>
       <w:r>
         <w:rPr>
+          <w:rFonts w:ascii="Calibri" w:hAnsi="Calibri"/>
           <w:b/>
           <w:color w:val="1F3A5F"/>
-          <w:sz w:val="22"/>
+          <w:sz w:val="21"/>
+          <w:spacing w:val="24"/>
         </w:rPr>
         <w:t>PROFESSIONAL EXPERIENCE</w:t>
       </w:r>
     </w:p>
     <w:p>
       <w:pPr>
-        <w:spacing w:before="120" w:after="20"/>
+        <w:tabs>
+          <w:tab w:pos="10080" w:val="right"/>
+        </w:tabs>
+        <w:spacing w:before="140" w:after="20"/>
       </w:pPr>
       <w:r>
         <w:rPr>
@@ -88,6 +171,7 @@
       <w:r>
         <w:rPr>
           <w:i/>
+          <w:color w:val="565656"/>
           <w:sz w:val="19"/>
         </w:rPr>
         <w:t>Jan 2024 – Present</w:t>
@@ -176,7 +260,10 @@
     </w:p>
     <w:p>
       <w:pPr>
-        <w:spacing w:before="120" w:after="20"/>
+        <w:tabs>
+          <w:tab w:pos="10080" w:val="right"/>
+        </w:tabs>
+        <w:spacing w:before="140" w:after="20"/>
       </w:pPr>
       <w:r>
         <w:rPr>
@@ -191,6 +278,7 @@
       <w:r>
         <w:rPr>
           <w:i/>
+          <w:color w:val="565656"/>
           <w:sz w:val="19"/>
         </w:rPr>
         <w:t>Feb 2023 – Jan 2024</w:t>
@@ -225,7 +313,10 @@
     </w:p>
     <w:p>
       <w:pPr>
-        <w:spacing w:before="120" w:after="20"/>
+        <w:tabs>
+          <w:tab w:pos="10080" w:val="right"/>
+        </w:tabs>
+        <w:spacing w:before="140" w:after="20"/>
       </w:pPr>
       <w:r>
         <w:rPr>
@@ -240,6 +331,7 @@
       <w:r>
         <w:rPr>
           <w:i/>
+          <w:color w:val="565656"/>
           <w:sz w:val="19"/>
         </w:rPr>
         <w:t>Jul 2022 – Dec 2022</w:t>
@@ -274,13 +366,18 @@
     </w:p>
     <w:p>
       <w:pPr>
-        <w:spacing w:before="200" w:after="40"/>
+        <w:spacing w:before="220" w:after="80"/>
+        <w:pBdr>
+          <w:bottom w:val="single" w:sz="6" w:space="3" w:color="1F3A5F"/>
+        </w:pBdr>
       </w:pPr>
       <w:r>
         <w:rPr>
+          <w:rFonts w:ascii="Calibri" w:hAnsi="Calibri"/>
           <w:b/>
           <w:color w:val="1F3A5F"/>
-          <w:sz w:val="22"/>
+          <w:sz w:val="21"/>
+          <w:spacing w:val="24"/>
         </w:rPr>
         <w:t>EDUCATION</w:t>
       </w:r>
@@ -321,13 +418,18 @@
     </w:p>
     <w:p>
       <w:pPr>
-        <w:spacing w:before="200" w:after="40"/>
+        <w:spacing w:before="220" w:after="80"/>
+        <w:pBdr>
+          <w:bottom w:val="single" w:sz="6" w:space="3" w:color="1F3A5F"/>
+        </w:pBdr>
       </w:pPr>
       <w:r>
         <w:rPr>
+          <w:rFonts w:ascii="Calibri" w:hAnsi="Calibri"/>
           <w:b/>
           <w:color w:val="1F3A5F"/>
-          <w:sz w:val="22"/>
+          <w:sz w:val="21"/>
+          <w:spacing w:val="24"/>
         </w:rPr>
         <w:t>TECHNICAL SKILLS</w:t>
       </w:r>
@@ -418,13 +520,18 @@
     </w:p>
     <w:p>
       <w:pPr>
-        <w:spacing w:before="200" w:after="40"/>
+        <w:spacing w:before="220" w:after="80"/>
+        <w:pBdr>
+          <w:bottom w:val="single" w:sz="6" w:space="3" w:color="1F3A5F"/>
+        </w:pBdr>
       </w:pPr>
       <w:r>
         <w:rPr>
+          <w:rFonts w:ascii="Calibri" w:hAnsi="Calibri"/>
           <w:b/>
           <w:color w:val="1F3A5F"/>
-          <w:sz w:val="22"/>
+          <w:sz w:val="21"/>
+          <w:spacing w:val="24"/>
         </w:rPr>
         <w:t>SELECTED AI SYSTEMS</w:t>
       </w:r>
@@ -521,13 +628,18 @@
     </w:p>
     <w:p>
       <w:pPr>
-        <w:spacing w:before="200" w:after="40"/>
+        <w:spacing w:before="220" w:after="80"/>
+        <w:pBdr>
+          <w:bottom w:val="single" w:sz="6" w:space="3" w:color="1F3A5F"/>
+        </w:pBdr>
       </w:pPr>
       <w:r>
         <w:rPr>
+          <w:rFonts w:ascii="Calibri" w:hAnsi="Calibri"/>
           <w:b/>
           <w:color w:val="1F3A5F"/>
-          <w:sz w:val="22"/>
+          <w:sz w:val="21"/>
+          <w:spacing w:val="24"/>
         </w:rPr>
         <w:t>CERTIFICATIONS &amp; COURSES</w:t>
       </w:r>
@@ -539,25 +651,30 @@
     </w:p>
     <w:p>
       <w:pPr>
-        <w:spacing w:before="200" w:after="40"/>
+        <w:spacing w:before="220" w:after="80"/>
+        <w:pBdr>
+          <w:bottom w:val="single" w:sz="6" w:space="3" w:color="1F3A5F"/>
+        </w:pBdr>
       </w:pPr>
       <w:r>
         <w:rPr>
+          <w:rFonts w:ascii="Calibri" w:hAnsi="Calibri"/>
           <w:b/>
           <w:color w:val="1F3A5F"/>
-          <w:sz w:val="22"/>
+          <w:sz w:val="21"/>
+          <w:spacing w:val="24"/>
         </w:rPr>
         <w:t>ADDITIONAL</w:t>
       </w:r>
     </w:p>
     <w:p>
       <w:r>
-        <w:t>Languages: English  ·  Links: LinkedIn, GitHub</w:t>
+        <w:t>Languages: English (professional)</w:t>
       </w:r>
     </w:p>
     <w:sectPr>
       <w:pgSz w:w="12240" w:h="15840"/>
-      <w:pgMar w:top="800" w:right="1000" w:bottom="800" w:left="1000" w:header="720" w:footer="720" w:gutter="0"/>
+      <w:pgMar w:top="760" w:right="1080" w:bottom="760" w:left="1080" w:header="720" w:footer="720" w:gutter="0"/>
       <w:cols w:space="720"/>
       <w:docGrid w:linePitch="360"/>
     </w:sectPr>

</xml_diff>

<commit_message>
Add Staff-level signals: AI platform ownership + stakeholder leadership
Reframes the lead bullet as reusable AI platform capabilities powering
multiple production AI applications; adds a stakeholder-leadership bullet
(risk/compliance/business); weaves the 'production AI' hiring keyword
across profile and experience.

https://claude.ai/code/session_01Mke6CVwT4vvgeJSyVZv8pc
</commit_message>
<xml_diff>
--- a/out/Dinc_Cetintas_AI_Engineer.docx
+++ b/out/Dinc_Cetintas_AI_Engineer.docx
@@ -183,7 +183,7 @@
         <w:spacing w:after="60"/>
       </w:pPr>
       <w:r>
-        <w:t>Architected and owned production LLM and RAG platforms for document intelligence, workflow automation, and conversational AI, deployed across 7+ business teams and 200+ internal users under banking compliance and data-governance controls.</w:t>
+        <w:t>Established reusable AI platform capabilities — shared retrieval, evaluation, document-intelligence, and model-serving components — accelerating delivery of multiple production AI applications across 7+ business teams and 200+ internal users under banking compliance and data-governance controls.</w:t>
       </w:r>
     </w:p>
     <w:p>
@@ -256,6 +256,15 @@
       </w:pPr>
       <w:r>
         <w:t>Delivered an on-prem Arabic↔English document-translation platform that preserves layout and keeps sensitive data fully in-house, eliminating ~$120K/yr in third-party translation spend.</w:t>
+      </w:r>
+    </w:p>
+    <w:p>
+      <w:pPr>
+        <w:pStyle w:val="ListBullet"/>
+        <w:spacing w:after="60"/>
+      </w:pPr>
+      <w:r>
+        <w:t>Partnered with risk, compliance, and business stakeholders to define requirements, align on success metrics, and drive adoption of production AI systems across multiple teams.</w:t>
       </w:r>
     </w:p>
     <w:p>

</xml_diff>

<commit_message>
Coherent MeeApps story, scoped standards, de-buzzword credit-risk
MeeApps reframed as a low-latency order-execution platform (smart
order-routing + execution algorithms) so both bullets tell one story;
folds architectural/evaluation/release standards (scoped to systems built)
into the governance bullet; rewords credit-risk workflow off 'agentic'.

https://claude.ai/code/session_01Mke6CVwT4vvgeJSyVZv8pc
</commit_message>
<xml_diff>
--- a/out/Dinc_Cetintas_AI_Engineer.docx
+++ b/out/Dinc_Cetintas_AI_Engineer.docx
@@ -201,7 +201,7 @@
         <w:spacing w:after="60"/>
       </w:pPr>
       <w:r>
-        <w:t>Established evaluation and release governance for production AI — automated quality benchmarks (retrieval quality, grounding, hallucination mitigation), human review loops, and auditability requirements enforced before every deployment.</w:t>
+        <w:t>Defined architectural, evaluation, and release standards for the production AI systems I built — automated quality benchmarks (retrieval quality, grounding, hallucination mitigation), human review loops, and auditability enforced before every deployment.</w:t>
       </w:r>
     </w:p>
     <w:p>
@@ -219,7 +219,7 @@
         <w:spacing w:after="60"/>
       </w:pPr>
       <w:r>
-        <w:t>Developed agentic credit-risk and financial-analysis report-generation workflows that retrieve data via tool calling, reason over it, and produce structured, analyst-ready reports.</w:t>
+        <w:t>Developed production AI workflows for credit-risk and financial analysis, combining retrieval, tool calling, and LLM reasoning to generate structured, analyst-ready reports.</w:t>
       </w:r>
     </w:p>
     <w:p>
@@ -299,7 +299,7 @@
         <w:spacing w:after="60"/>
       </w:pPr>
       <w:r>
-        <w:t>Designed and developed a high-frequency trading algorithm adopted by 23 brokerage firms managing $10M+ in portfolios, achieving microsecond-level order execution.</w:t>
+        <w:t>Built a low-latency order-execution platform — including smart order-routing and execution algorithms — adopted by 23 brokerage firms managing $10M+ in portfolios, achieving microsecond-level execution.</w:t>
       </w:r>
     </w:p>
     <w:p>
@@ -308,7 +308,7 @@
         <w:spacing w:after="60"/>
       </w:pPr>
       <w:r>
-        <w:t>Engineered the ultra-low-latency execution path — optimizing ITCH, OUCH, and TCP protocols against co-located exchange servers — and built the full production stack (React/C#/C++ frontend, backend services, and live market-data feeds).</w:t>
+        <w:t>Engineered the ultra-low-latency execution path by optimizing ITCH, OUCH, and TCP protocols against co-located exchange servers, and built the full production stack (React/C#/C++ frontend, backend services, and live market-data feeds).</w:t>
       </w:r>
     </w:p>
     <w:p>

</xml_diff>

<commit_message>
Add engineering judgment: tradeoffs, failure handling, platform internals, modern depth
Rewrites CBQ around why/how, not just what: hybrid BM25+vector rationale
(semantic-only missed regulatory terms), a real hallucination fix
(citation grounding + quality gates) with post-deploy monitoring/feedback
loops, concrete reusable platform components (retrieval/eval/serving),
and confirmed modern techniques (schema validation, prompt versioning,
model routing/fallbacks, context engineering); adds causality to metrics.

https://claude.ai/code/session_01Mke6CVwT4vvgeJSyVZv8pc
</commit_message>
<xml_diff>
--- a/out/Dinc_Cetintas_AI_Engineer.docx
+++ b/out/Dinc_Cetintas_AI_Engineer.docx
@@ -183,7 +183,7 @@
         <w:spacing w:after="60"/>
       </w:pPr>
       <w:r>
-        <w:t>Established reusable AI platform capabilities — shared retrieval, evaluation, document-intelligence, and model-serving components — accelerating delivery of multiple production AI applications across 7+ business teams and 200+ internal users under banking compliance and data-governance controls.</w:t>
+        <w:t>Built a reusable AI platform — a shared retrieval/embeddings service, a shared evaluation framework, and a common model-serving API — that multiple teams consumed to ship production AI applications across 7+ business teams and 200+ users, cutting time-to-delivery for each new app.</w:t>
       </w:r>
     </w:p>
     <w:p>
@@ -192,7 +192,7 @@
         <w:spacing w:after="60"/>
       </w:pPr>
       <w:r>
-        <w:t>Designed the RAG architecture — hybrid retrieval, semantic chunking, reranking, and citation grounding over 900+ compliance documents — delivering explainable, fully traceable, source-linked answers at 87% retrieval accuracy.</w:t>
+        <w:t>Chose hybrid retrieval (BM25 + vector) with reranking after semantic-only search missed exact regulatory and financial terminology, surfacing authoritative, citation-grounded passages for compliance and reaching 87% source-linked retrieval accuracy over 900+ documents.</w:t>
       </w:r>
     </w:p>
     <w:p>
@@ -201,7 +201,7 @@
         <w:spacing w:after="60"/>
       </w:pPr>
       <w:r>
-        <w:t>Defined architectural, evaluation, and release standards for the production AI systems I built — automated quality benchmarks (retrieval quality, grounding, hallucination mitigation), human review loops, and auditability enforced before every deployment.</w:t>
+        <w:t>Eliminated unsupported model outputs caught in pre-release testing via citation-grounded generation and retrieval-quality gates, then added post-deployment monitoring and feedback loops that detect retrieval regressions and hallucinations and feed them back into evaluation.</w:t>
       </w:r>
     </w:p>
     <w:p>
@@ -210,7 +210,7 @@
         <w:spacing w:after="60"/>
       </w:pPr>
       <w:r>
-        <w:t>Built an AI email &amp; inquiry assistant that auto-classifies and drafts responses to 500+ requests/week using LLM reasoning and structured outputs, cutting manual workload 70% and earning the COO Problem Solver Award.</w:t>
+        <w:t>Defined architectural, evaluation, and release standards for the production AI I built — automated benchmarks (retrieval quality, grounding, hallucination), schema-validated structured outputs, prompt versioning, human review loops, and auditability enforced before every deployment.</w:t>
       </w:r>
     </w:p>
     <w:p>
@@ -219,7 +219,7 @@
         <w:spacing w:after="60"/>
       </w:pPr>
       <w:r>
-        <w:t>Developed production AI workflows for credit-risk and financial analysis, combining retrieval, tool calling, and LLM reasoning to generate structured, analyst-ready reports.</w:t>
+        <w:t>Owned the FastAPI/REST serving layer with model routing, fallback strategies, and context engineering (context-window budgeting and compaction for long documents), cutting inference latency ~40% through optimized retrieval and containerized serving (Docker, Kubernetes, MLflow) with production monitoring.</w:t>
       </w:r>
     </w:p>
     <w:p>
@@ -228,7 +228,7 @@
         <w:spacing w:after="60"/>
       </w:pPr>
       <w:r>
-        <w:t>Engineered an OCR &amp; document-intelligence pipeline (7 extraction flows) for complex Arabic/English identity and financial documents, accelerating document handling ~65% with full traceability.</w:t>
+        <w:t>Developed production AI workflows for credit-risk and financial analysis that retrieve source data, call internal tools, reason with an LLM, and validate every output against a JSON schema to produce structured, analyst-ready reports.</w:t>
       </w:r>
     </w:p>
     <w:p>
@@ -237,7 +237,7 @@
         <w:spacing w:after="60"/>
       </w:pPr>
       <w:r>
-        <w:t>Built and owned the FastAPI / REST services and model-serving layer (Docker, Kubernetes, MLflow) with production monitoring and observability, cutting inference latency ~40% and ensuring reliability.</w:t>
+        <w:t>Built an AI email &amp; inquiry assistant handling 500+ requests/week with schema-validated structured outputs, cutting manual workload 70% and earning the COO Problem Solver Award.</w:t>
       </w:r>
     </w:p>
     <w:p>
@@ -247,15 +247,6 @@
       </w:pPr>
       <w:r>
         <w:t>Designed and deployed a real-time fraud-detection service integrating engineered risk features, model evaluation, and monitoring, achieving ROC-AUC 0.93 while strengthening transaction-risk controls.</w:t>
-      </w:r>
-    </w:p>
-    <w:p>
-      <w:pPr>
-        <w:pStyle w:val="ListBullet"/>
-        <w:spacing w:after="60"/>
-      </w:pPr>
-      <w:r>
-        <w:t>Delivered an on-prem Arabic↔English document-translation platform that preserves layout and keeps sensitive data fully in-house, eliminating ~$120K/yr in third-party translation spend.</w:t>
       </w:r>
     </w:p>
     <w:p>
@@ -454,7 +445,7 @@
         <w:t xml:space="preserve">AI Systems / GenAI: </w:t>
       </w:r>
       <w:r>
-        <w:t>LLM systems, RAG (hybrid retrieval, reranking, citation grounding), agentic workflows, tool / function calling, prompt &amp; context engineering, structured outputs</w:t>
+        <w:t>LLM systems, RAG (hybrid BM25+vector, reranking, citation grounding), tool / function calling, structured outputs &amp; JSON-schema validation, prompt versioning, context engineering, agentic workflows</w:t>
       </w:r>
     </w:p>
     <w:p>
@@ -468,7 +459,7 @@
         <w:t xml:space="preserve">AI Engineering / LLMOps: </w:t>
       </w:r>
       <w:r>
-        <w:t>Automated evaluation (retrieval quality, grounding, hallucination mitigation), human review loops, observability &amp; logging, latency optimization, reliability engineering</w:t>
+        <w:t>Automated evaluation (retrieval quality, grounding, hallucination mitigation), human review loops, monitoring &amp; feedback loops, model routing &amp; fallback strategies, latency optimization, reliability engineering</w:t>
       </w:r>
     </w:p>
     <w:p>
@@ -617,7 +608,7 @@
         <w:t xml:space="preserve">OCR &amp; Document Intelligence Platform — </w:t>
       </w:r>
       <w:r>
-        <w:t>7 extraction pipelines for Arabic/English ID &amp; financial docs</w:t>
+        <w:t>7 extraction flows for Arabic/English ID &amp; financial docs; ~65% faster, traceable</w:t>
       </w:r>
     </w:p>
     <w:p>
@@ -632,7 +623,7 @@
         <w:t xml:space="preserve">Arabic↔English Translation Platform — </w:t>
       </w:r>
       <w:r>
-        <w:t>on-prem, layout-preserving; ~$120K/yr third-party spend eliminated</w:t>
+        <w:t>on-prem, layout-preserving, data-resident; ~$120K/yr third-party spend eliminated</w:t>
       </w:r>
     </w:p>
     <w:p>

</xml_diff>